<commit_message>
Updated the images for Kairos project
</commit_message>
<xml_diff>
--- a/src/assets/images/developer-resume-template.docx
+++ b/src/assets/images/developer-resume-template.docx
@@ -759,6 +759,7 @@
         <w:tabs>
           <w:tab w:val="left" w:pos="284"/>
           <w:tab w:val="left" w:pos="630"/>
+          <w:tab w:val="num" w:pos="720"/>
           <w:tab w:val="left" w:pos="900"/>
         </w:tabs>
         <w:ind w:left="14"/>
@@ -790,7 +791,7 @@
           <w:sz w:val="21"/>
           <w:szCs w:val="21"/>
         </w:rPr>
-        <w:t>ACCENTURE INC.</w:t>
+        <w:t>CONCENTRIX</w:t>
       </w:r>
       <w:r>
         <w:rPr>
@@ -799,7 +800,22 @@
           <w:szCs w:val="21"/>
         </w:rPr>
         <w:tab/>
-        <w:t>Mandaluyong, Cybergate</w:t>
+      </w:r>
+      <w:r>
+        <w:rPr>
+          <w:rFonts w:ascii="Garamond" w:eastAsia="Garamond" w:hAnsi="Garamond" w:cs="Garamond"/>
+          <w:sz w:val="21"/>
+          <w:szCs w:val="21"/>
+        </w:rPr>
+        <w:t>Naga City</w:t>
+      </w:r>
+      <w:r>
+        <w:rPr>
+          <w:rFonts w:ascii="Garamond" w:eastAsia="Garamond" w:hAnsi="Garamond" w:cs="Garamond"/>
+          <w:sz w:val="21"/>
+          <w:szCs w:val="21"/>
+        </w:rPr>
+        <w:t xml:space="preserve"> </w:t>
       </w:r>
     </w:p>
     <w:p>
@@ -820,7 +836,7 @@
           <w:sz w:val="21"/>
           <w:szCs w:val="21"/>
         </w:rPr>
-        <w:t>Application Development Associate</w:t>
+        <w:t>Advisor I</w:t>
       </w:r>
       <w:r>
         <w:rPr>
@@ -829,7 +845,54 @@
           <w:szCs w:val="21"/>
         </w:rPr>
         <w:tab/>
-        <w:t>Jun 2022 – Jul 2024</w:t>
+      </w:r>
+      <w:r>
+        <w:rPr>
+          <w:rFonts w:ascii="Garamond" w:eastAsia="Garamond" w:hAnsi="Garamond" w:cs="Garamond"/>
+          <w:sz w:val="21"/>
+          <w:szCs w:val="21"/>
+        </w:rPr>
+        <w:tab/>
+      </w:r>
+      <w:r>
+        <w:rPr>
+          <w:rFonts w:ascii="Garamond" w:eastAsia="Garamond" w:hAnsi="Garamond" w:cs="Garamond"/>
+          <w:sz w:val="21"/>
+          <w:szCs w:val="21"/>
+        </w:rPr>
+        <w:t>Nov</w:t>
+      </w:r>
+      <w:r>
+        <w:rPr>
+          <w:rFonts w:ascii="Garamond" w:eastAsia="Garamond" w:hAnsi="Garamond" w:cs="Garamond"/>
+          <w:sz w:val="21"/>
+          <w:szCs w:val="21"/>
+        </w:rPr>
+        <w:t xml:space="preserve"> 202</w:t>
+      </w:r>
+      <w:r>
+        <w:rPr>
+          <w:rFonts w:ascii="Garamond" w:eastAsia="Garamond" w:hAnsi="Garamond" w:cs="Garamond"/>
+          <w:sz w:val="21"/>
+          <w:szCs w:val="21"/>
+        </w:rPr>
+        <w:t>4</w:t>
+      </w:r>
+      <w:r>
+        <w:rPr>
+          <w:rFonts w:ascii="Garamond" w:eastAsia="Garamond" w:hAnsi="Garamond" w:cs="Garamond"/>
+          <w:sz w:val="21"/>
+          <w:szCs w:val="21"/>
+        </w:rPr>
+        <w:t xml:space="preserve"> – Jul 202</w:t>
+      </w:r>
+      <w:r>
+        <w:rPr>
+          <w:rFonts w:ascii="Garamond" w:eastAsia="Garamond" w:hAnsi="Garamond" w:cs="Garamond"/>
+          <w:sz w:val="21"/>
+          <w:szCs w:val="21"/>
+        </w:rPr>
+        <w:t>5</w:t>
       </w:r>
     </w:p>
     <w:p>
@@ -856,7 +919,7 @@
           <w:sz w:val="21"/>
           <w:szCs w:val="21"/>
         </w:rPr>
-        <w:t>In charge of maintaining and enhancing client Salesforce applications through Salesforce Configuration &amp; Setup, Object Manager, and Lightning App Builder.</w:t>
+        <w:t>Responsible for managing insurance policies, claims, benefits, and customer service through the Salesforce platform.</w:t>
       </w:r>
     </w:p>
     <w:p>
@@ -884,7 +947,7 @@
           <w:sz w:val="21"/>
           <w:szCs w:val="21"/>
         </w:rPr>
-        <w:t>Performed manual test execution, defect management via JIRA, and test case planning using Agile methodologies.</w:t>
+        <w:t>Delivered high-quality customer support across insurance product lines.</w:t>
       </w:r>
     </w:p>
     <w:p>
@@ -912,7 +975,85 @@
           <w:sz w:val="21"/>
           <w:szCs w:val="21"/>
         </w:rPr>
-        <w:t>Supported user acceptance testing (UAT) and provided post-release user support.</w:t>
+        <w:t>Maintained detailed case records and followed escalation protocols for claims assistance and stakeholder communication.</w:t>
+      </w:r>
+    </w:p>
+    <w:p>
+      <w:pPr>
+        <w:tabs>
+          <w:tab w:val="left" w:pos="284"/>
+          <w:tab w:val="left" w:pos="630"/>
+          <w:tab w:val="left" w:pos="900"/>
+        </w:tabs>
+        <w:ind w:left="284"/>
+        <w:rPr>
+          <w:rFonts w:ascii="Garamond" w:eastAsia="Garamond" w:hAnsi="Garamond" w:cs="Garamond"/>
+          <w:sz w:val="21"/>
+          <w:szCs w:val="21"/>
+        </w:rPr>
+      </w:pPr>
+    </w:p>
+    <w:p>
+      <w:pPr>
+        <w:tabs>
+          <w:tab w:val="left" w:pos="1134"/>
+          <w:tab w:val="right" w:pos="10503"/>
+        </w:tabs>
+        <w:rPr>
+          <w:rFonts w:ascii="Garamond" w:eastAsia="Garamond" w:hAnsi="Garamond" w:cs="Garamond"/>
+          <w:sz w:val="21"/>
+          <w:szCs w:val="21"/>
+        </w:rPr>
+      </w:pPr>
+      <w:r>
+        <w:rPr>
+          <w:rFonts w:ascii="Garamond" w:eastAsia="Garamond" w:hAnsi="Garamond" w:cs="Garamond"/>
+          <w:b/>
+          <w:bCs/>
+          <w:color w:val="404040"/>
+          <w:sz w:val="21"/>
+          <w:szCs w:val="21"/>
+        </w:rPr>
+        <w:t>ACCENTURE INC.</w:t>
+      </w:r>
+      <w:r>
+        <w:rPr>
+          <w:rFonts w:ascii="Garamond" w:eastAsia="Garamond" w:hAnsi="Garamond" w:cs="Garamond"/>
+          <w:sz w:val="21"/>
+          <w:szCs w:val="21"/>
+        </w:rPr>
+        <w:tab/>
+        <w:t>Mandaluyong, Cybergate</w:t>
+      </w:r>
+    </w:p>
+    <w:p>
+      <w:pPr>
+        <w:tabs>
+          <w:tab w:val="left" w:pos="1134"/>
+          <w:tab w:val="right" w:pos="10503"/>
+        </w:tabs>
+        <w:rPr>
+          <w:rFonts w:ascii="Garamond" w:eastAsia="Garamond" w:hAnsi="Garamond" w:cs="Garamond"/>
+          <w:sz w:val="22"/>
+          <w:szCs w:val="22"/>
+        </w:rPr>
+      </w:pPr>
+      <w:r>
+        <w:rPr>
+          <w:rFonts w:ascii="Garamond" w:eastAsia="Garamond" w:hAnsi="Garamond" w:cs="Garamond"/>
+          <w:sz w:val="21"/>
+          <w:szCs w:val="21"/>
+        </w:rPr>
+        <w:t>Application Development Associate</w:t>
+      </w:r>
+      <w:r>
+        <w:rPr>
+          <w:rFonts w:ascii="Garamond" w:eastAsia="Garamond" w:hAnsi="Garamond" w:cs="Garamond"/>
+          <w:sz w:val="21"/>
+          <w:szCs w:val="21"/>
+        </w:rPr>
+        <w:tab/>
+        <w:t>Jun 2022 – Jul 2024</w:t>
       </w:r>
     </w:p>
     <w:p>
@@ -924,7 +1065,6 @@
         <w:tabs>
           <w:tab w:val="left" w:pos="284"/>
           <w:tab w:val="left" w:pos="630"/>
-          <w:tab w:val="num" w:pos="720"/>
           <w:tab w:val="left" w:pos="900"/>
         </w:tabs>
         <w:ind w:left="284" w:hanging="270"/>
@@ -940,84 +1080,7 @@
           <w:sz w:val="21"/>
           <w:szCs w:val="21"/>
         </w:rPr>
-        <w:t>Collaborated within Agile sprints using Jira, contributing to sprint planning and retrospectives.</w:t>
-      </w:r>
-    </w:p>
-    <w:p>
-      <w:pPr>
-        <w:tabs>
-          <w:tab w:val="left" w:pos="284"/>
-          <w:tab w:val="left" w:pos="630"/>
-          <w:tab w:val="left" w:pos="900"/>
-        </w:tabs>
-        <w:rPr>
-          <w:rFonts w:ascii="Garamond" w:eastAsia="Garamond" w:hAnsi="Garamond" w:cs="Garamond"/>
-          <w:sz w:val="21"/>
-          <w:szCs w:val="21"/>
-        </w:rPr>
-      </w:pPr>
-    </w:p>
-    <w:p>
-      <w:pPr>
-        <w:tabs>
-          <w:tab w:val="left" w:pos="1134"/>
-          <w:tab w:val="right" w:pos="10503"/>
-        </w:tabs>
-        <w:rPr>
-          <w:rFonts w:ascii="Garamond" w:eastAsia="Garamond" w:hAnsi="Garamond" w:cs="Garamond"/>
-          <w:sz w:val="21"/>
-          <w:szCs w:val="21"/>
-        </w:rPr>
-      </w:pPr>
-      <w:r>
-        <w:rPr>
-          <w:rFonts w:ascii="Garamond" w:eastAsia="Garamond" w:hAnsi="Garamond" w:cs="Garamond"/>
-          <w:b/>
-          <w:bCs/>
-          <w:color w:val="404040"/>
-          <w:sz w:val="21"/>
-          <w:szCs w:val="21"/>
-        </w:rPr>
-        <w:t>3GX COMPUTERS &amp; SOLUTIONS - Internship</w:t>
-      </w:r>
-      <w:r>
-        <w:rPr>
-          <w:rFonts w:ascii="Garamond" w:eastAsia="Garamond" w:hAnsi="Garamond" w:cs="Garamond"/>
-          <w:sz w:val="21"/>
-          <w:szCs w:val="21"/>
-        </w:rPr>
-        <w:tab/>
-        <w:t xml:space="preserve">Naga City </w:t>
-      </w:r>
-    </w:p>
-    <w:p>
-      <w:pPr>
-        <w:tabs>
-          <w:tab w:val="left" w:pos="1134"/>
-          <w:tab w:val="right" w:pos="10503"/>
-        </w:tabs>
-        <w:rPr>
-          <w:rFonts w:ascii="Garamond" w:eastAsia="Garamond" w:hAnsi="Garamond" w:cs="Garamond"/>
-          <w:sz w:val="22"/>
-          <w:szCs w:val="22"/>
-        </w:rPr>
-      </w:pPr>
-      <w:r>
-        <w:rPr>
-          <w:rFonts w:ascii="Garamond" w:eastAsia="Garamond" w:hAnsi="Garamond" w:cs="Garamond"/>
-          <w:sz w:val="21"/>
-          <w:szCs w:val="21"/>
-        </w:rPr>
-        <w:t>Junior Web Developer</w:t>
-      </w:r>
-      <w:r>
-        <w:rPr>
-          <w:rFonts w:ascii="Garamond" w:eastAsia="Garamond" w:hAnsi="Garamond" w:cs="Garamond"/>
-          <w:sz w:val="21"/>
-          <w:szCs w:val="21"/>
-        </w:rPr>
-        <w:tab/>
-        <w:t>Jan 2020 – Mar 2020</w:t>
+        <w:t>In charge of maintaining and enhancing client Salesforce applications through Salesforce Configuration &amp; Setup, Object Manager, and Lightning App Builder.</w:t>
       </w:r>
     </w:p>
     <w:p>
@@ -1029,6 +1092,7 @@
         <w:tabs>
           <w:tab w:val="left" w:pos="284"/>
           <w:tab w:val="left" w:pos="630"/>
+          <w:tab w:val="num" w:pos="720"/>
           <w:tab w:val="left" w:pos="900"/>
         </w:tabs>
         <w:ind w:left="284" w:hanging="270"/>
@@ -1044,7 +1108,7 @@
           <w:sz w:val="21"/>
           <w:szCs w:val="21"/>
         </w:rPr>
-        <w:t>Maintained, documented, and resolved issues within the BullGuardPH application — the Philippines' official antivirus distributor.</w:t>
+        <w:t>Performed manual test execution, defect management via JIRA, and test case planning using Agile methodologies.</w:t>
       </w:r>
     </w:p>
     <w:p>
@@ -1072,7 +1136,7 @@
           <w:sz w:val="21"/>
           <w:szCs w:val="21"/>
         </w:rPr>
-        <w:t>Utilized Laravel Framework with AJAX, plugins, and Git for web application maintenance and bug tracking.</w:t>
+        <w:t>Supported user acceptance testing (UAT) and provided post-release user support.</w:t>
       </w:r>
     </w:p>
     <w:p>
@@ -1100,8 +1164,508 @@
           <w:sz w:val="21"/>
           <w:szCs w:val="21"/>
         </w:rPr>
+        <w:t>Collaborated within Agile sprints using Jira, contributing to sprint planning and retrospectives.</w:t>
+      </w:r>
+    </w:p>
+    <w:p>
+      <w:pPr>
+        <w:tabs>
+          <w:tab w:val="left" w:pos="284"/>
+          <w:tab w:val="left" w:pos="630"/>
+          <w:tab w:val="num" w:pos="720"/>
+          <w:tab w:val="left" w:pos="900"/>
+        </w:tabs>
+        <w:rPr>
+          <w:rFonts w:ascii="Garamond" w:eastAsia="Garamond" w:hAnsi="Garamond" w:cs="Garamond"/>
+          <w:sz w:val="21"/>
+          <w:szCs w:val="21"/>
+        </w:rPr>
+      </w:pPr>
+    </w:p>
+    <w:p>
+      <w:pPr>
+        <w:tabs>
+          <w:tab w:val="left" w:pos="1134"/>
+          <w:tab w:val="right" w:pos="10503"/>
+        </w:tabs>
+        <w:rPr>
+          <w:rFonts w:ascii="Garamond" w:eastAsia="Garamond" w:hAnsi="Garamond" w:cs="Garamond"/>
+          <w:sz w:val="21"/>
+          <w:szCs w:val="21"/>
+        </w:rPr>
+      </w:pPr>
+      <w:r>
+        <w:rPr>
+          <w:rFonts w:ascii="Garamond" w:eastAsia="Garamond" w:hAnsi="Garamond" w:cs="Garamond"/>
+          <w:b/>
+          <w:bCs/>
+          <w:color w:val="404040"/>
+          <w:sz w:val="21"/>
+          <w:szCs w:val="21"/>
+        </w:rPr>
+        <w:t xml:space="preserve">HYUNDAI </w:t>
+      </w:r>
+      <w:r>
+        <w:rPr>
+          <w:rFonts w:ascii="Garamond" w:eastAsia="Garamond" w:hAnsi="Garamond" w:cs="Garamond"/>
+          <w:b/>
+          <w:bCs/>
+          <w:color w:val="404040"/>
+          <w:sz w:val="21"/>
+          <w:szCs w:val="21"/>
+        </w:rPr>
+        <w:tab/>
+        <w:t>NAGA</w:t>
+      </w:r>
+      <w:r>
+        <w:rPr>
+          <w:rFonts w:ascii="Garamond" w:eastAsia="Garamond" w:hAnsi="Garamond" w:cs="Garamond"/>
+          <w:sz w:val="21"/>
+          <w:szCs w:val="21"/>
+        </w:rPr>
+        <w:tab/>
+      </w:r>
+      <w:r>
+        <w:rPr>
+          <w:rFonts w:ascii="Garamond" w:eastAsia="Garamond" w:hAnsi="Garamond" w:cs="Garamond"/>
+          <w:sz w:val="21"/>
+          <w:szCs w:val="21"/>
+        </w:rPr>
+        <w:t xml:space="preserve">Del Rosario, </w:t>
+      </w:r>
+      <w:r>
+        <w:rPr>
+          <w:rFonts w:ascii="Garamond" w:eastAsia="Garamond" w:hAnsi="Garamond" w:cs="Garamond"/>
+          <w:sz w:val="21"/>
+          <w:szCs w:val="21"/>
+        </w:rPr>
+        <w:t xml:space="preserve">Naga City </w:t>
+      </w:r>
+    </w:p>
+    <w:p>
+      <w:pPr>
+        <w:tabs>
+          <w:tab w:val="left" w:pos="1134"/>
+          <w:tab w:val="right" w:pos="10503"/>
+        </w:tabs>
+        <w:rPr>
+          <w:rFonts w:ascii="Garamond" w:eastAsia="Garamond" w:hAnsi="Garamond" w:cs="Garamond"/>
+          <w:sz w:val="22"/>
+          <w:szCs w:val="22"/>
+        </w:rPr>
+      </w:pPr>
+      <w:r>
+        <w:rPr>
+          <w:rFonts w:ascii="Garamond" w:eastAsia="Garamond" w:hAnsi="Garamond" w:cs="Garamond"/>
+          <w:sz w:val="21"/>
+          <w:szCs w:val="21"/>
+        </w:rPr>
+        <w:t>Digital Marketing Administrator</w:t>
+      </w:r>
+      <w:r>
+        <w:rPr>
+          <w:rFonts w:ascii="Garamond" w:eastAsia="Garamond" w:hAnsi="Garamond" w:cs="Garamond"/>
+          <w:sz w:val="21"/>
+          <w:szCs w:val="21"/>
+        </w:rPr>
+        <w:tab/>
+      </w:r>
+      <w:r>
+        <w:rPr>
+          <w:rFonts w:ascii="Garamond" w:eastAsia="Garamond" w:hAnsi="Garamond" w:cs="Garamond"/>
+          <w:sz w:val="21"/>
+          <w:szCs w:val="21"/>
+        </w:rPr>
+        <w:t xml:space="preserve">Dec </w:t>
+      </w:r>
+      <w:r>
+        <w:rPr>
+          <w:rFonts w:ascii="Garamond" w:eastAsia="Garamond" w:hAnsi="Garamond" w:cs="Garamond"/>
+          <w:sz w:val="21"/>
+          <w:szCs w:val="21"/>
+        </w:rPr>
+        <w:t>202</w:t>
+      </w:r>
+      <w:r>
+        <w:rPr>
+          <w:rFonts w:ascii="Garamond" w:eastAsia="Garamond" w:hAnsi="Garamond" w:cs="Garamond"/>
+          <w:sz w:val="21"/>
+          <w:szCs w:val="21"/>
+        </w:rPr>
+        <w:t>1</w:t>
+      </w:r>
+      <w:r>
+        <w:rPr>
+          <w:rFonts w:ascii="Garamond" w:eastAsia="Garamond" w:hAnsi="Garamond" w:cs="Garamond"/>
+          <w:sz w:val="21"/>
+          <w:szCs w:val="21"/>
+        </w:rPr>
+        <w:t xml:space="preserve"> –</w:t>
+      </w:r>
+      <w:r>
+        <w:rPr>
+          <w:rFonts w:ascii="Garamond" w:eastAsia="Garamond" w:hAnsi="Garamond" w:cs="Garamond"/>
+          <w:sz w:val="21"/>
+          <w:szCs w:val="21"/>
+        </w:rPr>
+        <w:t xml:space="preserve">Apr </w:t>
+      </w:r>
+      <w:r>
+        <w:rPr>
+          <w:rFonts w:ascii="Garamond" w:eastAsia="Garamond" w:hAnsi="Garamond" w:cs="Garamond"/>
+          <w:sz w:val="21"/>
+          <w:szCs w:val="21"/>
+        </w:rPr>
+        <w:t>202</w:t>
+      </w:r>
+      <w:r>
+        <w:rPr>
+          <w:rFonts w:ascii="Garamond" w:eastAsia="Garamond" w:hAnsi="Garamond" w:cs="Garamond"/>
+          <w:sz w:val="21"/>
+          <w:szCs w:val="21"/>
+        </w:rPr>
+        <w:t>2</w:t>
+      </w:r>
+    </w:p>
+    <w:p>
+      <w:pPr>
+        <w:numPr>
+          <w:ilvl w:val="0"/>
+          <w:numId w:val="1"/>
+        </w:numPr>
+        <w:tabs>
+          <w:tab w:val="left" w:pos="284"/>
+          <w:tab w:val="left" w:pos="630"/>
+          <w:tab w:val="left" w:pos="900"/>
+        </w:tabs>
+        <w:ind w:left="284" w:hanging="270"/>
+        <w:rPr>
+          <w:rFonts w:ascii="Garamond" w:eastAsia="Garamond" w:hAnsi="Garamond" w:cs="Garamond"/>
+          <w:sz w:val="21"/>
+          <w:szCs w:val="21"/>
+        </w:rPr>
+      </w:pPr>
+      <w:r>
+        <w:rPr>
+          <w:rFonts w:ascii="Garamond" w:eastAsia="Garamond" w:hAnsi="Garamond" w:cs="Garamond"/>
+          <w:sz w:val="21"/>
+          <w:szCs w:val="21"/>
+        </w:rPr>
+        <w:t>Handled digital marketing and advertising using Adobe Illustrator, Photoshop, and Premiere.</w:t>
+      </w:r>
+    </w:p>
+    <w:p>
+      <w:pPr>
+        <w:numPr>
+          <w:ilvl w:val="0"/>
+          <w:numId w:val="1"/>
+        </w:numPr>
+        <w:tabs>
+          <w:tab w:val="left" w:pos="284"/>
+          <w:tab w:val="left" w:pos="630"/>
+          <w:tab w:val="num" w:pos="720"/>
+          <w:tab w:val="left" w:pos="900"/>
+        </w:tabs>
+        <w:ind w:left="284" w:hanging="270"/>
+        <w:rPr>
+          <w:rFonts w:ascii="Garamond" w:eastAsia="Garamond" w:hAnsi="Garamond" w:cs="Garamond"/>
+          <w:sz w:val="21"/>
+          <w:szCs w:val="21"/>
+        </w:rPr>
+      </w:pPr>
+      <w:r>
+        <w:rPr>
+          <w:rFonts w:ascii="Garamond" w:eastAsia="Garamond" w:hAnsi="Garamond" w:cs="Garamond"/>
+          <w:sz w:val="21"/>
+          <w:szCs w:val="21"/>
+        </w:rPr>
+        <w:t>In charge of sales marketing and promoting various products, services, units, and limited-time offers.</w:t>
+      </w:r>
+    </w:p>
+    <w:p>
+      <w:pPr>
+        <w:numPr>
+          <w:ilvl w:val="0"/>
+          <w:numId w:val="1"/>
+        </w:numPr>
+        <w:tabs>
+          <w:tab w:val="left" w:pos="284"/>
+          <w:tab w:val="left" w:pos="630"/>
+          <w:tab w:val="num" w:pos="720"/>
+          <w:tab w:val="left" w:pos="900"/>
+        </w:tabs>
+        <w:ind w:left="284" w:hanging="270"/>
+        <w:rPr>
+          <w:rFonts w:ascii="Garamond" w:eastAsia="Garamond" w:hAnsi="Garamond" w:cs="Garamond"/>
+          <w:sz w:val="21"/>
+          <w:szCs w:val="21"/>
+        </w:rPr>
+      </w:pPr>
+      <w:r>
+        <w:rPr>
+          <w:rFonts w:ascii="Garamond" w:eastAsia="Garamond" w:hAnsi="Garamond" w:cs="Garamond"/>
+          <w:sz w:val="21"/>
+          <w:szCs w:val="21"/>
+        </w:rPr>
+        <w:t>Coordinated with the sales team to align digital content with monthly targets and brand promotion goals.</w:t>
+      </w:r>
+    </w:p>
+    <w:p>
+      <w:pPr>
+        <w:tabs>
+          <w:tab w:val="left" w:pos="284"/>
+          <w:tab w:val="left" w:pos="630"/>
+          <w:tab w:val="left" w:pos="900"/>
+        </w:tabs>
+        <w:ind w:left="284"/>
+        <w:rPr>
+          <w:rFonts w:ascii="Garamond" w:eastAsia="Garamond" w:hAnsi="Garamond" w:cs="Garamond"/>
+          <w:sz w:val="21"/>
+          <w:szCs w:val="21"/>
+        </w:rPr>
+      </w:pPr>
+    </w:p>
+    <w:p>
+      <w:pPr>
+        <w:tabs>
+          <w:tab w:val="left" w:pos="1134"/>
+          <w:tab w:val="right" w:pos="10503"/>
+        </w:tabs>
+        <w:rPr>
+          <w:rFonts w:ascii="Garamond" w:eastAsia="Garamond" w:hAnsi="Garamond" w:cs="Garamond"/>
+          <w:sz w:val="21"/>
+          <w:szCs w:val="21"/>
+        </w:rPr>
+      </w:pPr>
+      <w:r>
+        <w:rPr>
+          <w:rFonts w:ascii="Garamond" w:eastAsia="Garamond" w:hAnsi="Garamond" w:cs="Garamond"/>
+          <w:b/>
+          <w:bCs/>
+          <w:color w:val="404040"/>
+          <w:sz w:val="21"/>
+          <w:szCs w:val="21"/>
+        </w:rPr>
+        <w:t>3GX COMPUTERS &amp; SOLUTIONS - Internship</w:t>
+      </w:r>
+      <w:r>
+        <w:rPr>
+          <w:rFonts w:ascii="Garamond" w:eastAsia="Garamond" w:hAnsi="Garamond" w:cs="Garamond"/>
+          <w:sz w:val="21"/>
+          <w:szCs w:val="21"/>
+        </w:rPr>
+        <w:tab/>
+        <w:t xml:space="preserve">Naga City </w:t>
+      </w:r>
+    </w:p>
+    <w:p>
+      <w:pPr>
+        <w:tabs>
+          <w:tab w:val="left" w:pos="1134"/>
+          <w:tab w:val="right" w:pos="10503"/>
+        </w:tabs>
+        <w:rPr>
+          <w:rFonts w:ascii="Garamond" w:eastAsia="Garamond" w:hAnsi="Garamond" w:cs="Garamond"/>
+          <w:sz w:val="22"/>
+          <w:szCs w:val="22"/>
+        </w:rPr>
+      </w:pPr>
+      <w:r>
+        <w:rPr>
+          <w:rFonts w:ascii="Garamond" w:eastAsia="Garamond" w:hAnsi="Garamond" w:cs="Garamond"/>
+          <w:sz w:val="21"/>
+          <w:szCs w:val="21"/>
+        </w:rPr>
+        <w:t>Junior Web Developer</w:t>
+      </w:r>
+      <w:r>
+        <w:rPr>
+          <w:rFonts w:ascii="Garamond" w:eastAsia="Garamond" w:hAnsi="Garamond" w:cs="Garamond"/>
+          <w:sz w:val="21"/>
+          <w:szCs w:val="21"/>
+        </w:rPr>
+        <w:tab/>
+        <w:t>Jan 2020 – Mar 2020</w:t>
+      </w:r>
+    </w:p>
+    <w:p>
+      <w:pPr>
+        <w:numPr>
+          <w:ilvl w:val="0"/>
+          <w:numId w:val="1"/>
+        </w:numPr>
+        <w:tabs>
+          <w:tab w:val="left" w:pos="284"/>
+          <w:tab w:val="left" w:pos="630"/>
+          <w:tab w:val="left" w:pos="900"/>
+        </w:tabs>
+        <w:ind w:left="284" w:hanging="270"/>
+        <w:rPr>
+          <w:rFonts w:ascii="Garamond" w:eastAsia="Garamond" w:hAnsi="Garamond" w:cs="Garamond"/>
+          <w:sz w:val="21"/>
+          <w:szCs w:val="21"/>
+        </w:rPr>
+      </w:pPr>
+      <w:r>
+        <w:rPr>
+          <w:rFonts w:ascii="Garamond" w:eastAsia="Garamond" w:hAnsi="Garamond" w:cs="Garamond"/>
+          <w:sz w:val="21"/>
+          <w:szCs w:val="21"/>
+        </w:rPr>
+        <w:t>Maintained, documented, and resolved issues within the BullGuardPH application — the Philippines' official antivirus distributor.</w:t>
+      </w:r>
+    </w:p>
+    <w:p>
+      <w:pPr>
+        <w:numPr>
+          <w:ilvl w:val="0"/>
+          <w:numId w:val="1"/>
+        </w:numPr>
+        <w:tabs>
+          <w:tab w:val="left" w:pos="284"/>
+          <w:tab w:val="left" w:pos="630"/>
+          <w:tab w:val="num" w:pos="720"/>
+          <w:tab w:val="left" w:pos="900"/>
+        </w:tabs>
+        <w:ind w:left="284" w:hanging="270"/>
+        <w:rPr>
+          <w:rFonts w:ascii="Garamond" w:eastAsia="Garamond" w:hAnsi="Garamond" w:cs="Garamond"/>
+          <w:sz w:val="21"/>
+          <w:szCs w:val="21"/>
+        </w:rPr>
+      </w:pPr>
+      <w:r>
+        <w:rPr>
+          <w:rFonts w:ascii="Garamond" w:eastAsia="Garamond" w:hAnsi="Garamond" w:cs="Garamond"/>
+          <w:sz w:val="21"/>
+          <w:szCs w:val="21"/>
+        </w:rPr>
+        <w:t>Utilized Laravel Framework with AJAX, plugins, and Git for web application maintenance and bug tracking.</w:t>
+      </w:r>
+    </w:p>
+    <w:p>
+      <w:pPr>
+        <w:numPr>
+          <w:ilvl w:val="0"/>
+          <w:numId w:val="1"/>
+        </w:numPr>
+        <w:tabs>
+          <w:tab w:val="left" w:pos="284"/>
+          <w:tab w:val="left" w:pos="630"/>
+          <w:tab w:val="num" w:pos="720"/>
+          <w:tab w:val="left" w:pos="900"/>
+        </w:tabs>
+        <w:ind w:left="284" w:hanging="270"/>
+        <w:rPr>
+          <w:rFonts w:ascii="Garamond" w:eastAsia="Garamond" w:hAnsi="Garamond" w:cs="Garamond"/>
+          <w:sz w:val="21"/>
+          <w:szCs w:val="21"/>
+        </w:rPr>
+      </w:pPr>
+      <w:r>
+        <w:rPr>
+          <w:rFonts w:ascii="Garamond" w:eastAsia="Garamond" w:hAnsi="Garamond" w:cs="Garamond"/>
+          <w:sz w:val="21"/>
+          <w:szCs w:val="21"/>
+        </w:rPr>
         <w:t>Implemented AJAX-driven UI enhancements, integrated third-party plugins, and maintained version control using Git.</w:t>
       </w:r>
+    </w:p>
+    <w:p>
+      <w:pPr>
+        <w:tabs>
+          <w:tab w:val="left" w:pos="284"/>
+          <w:tab w:val="left" w:pos="630"/>
+          <w:tab w:val="left" w:pos="900"/>
+        </w:tabs>
+        <w:ind w:left="284"/>
+        <w:rPr>
+          <w:rFonts w:ascii="Garamond" w:eastAsia="Garamond" w:hAnsi="Garamond" w:cs="Garamond"/>
+          <w:color w:val="404040"/>
+          <w:sz w:val="21"/>
+          <w:szCs w:val="21"/>
+        </w:rPr>
+      </w:pPr>
+    </w:p>
+    <w:p>
+      <w:pPr>
+        <w:tabs>
+          <w:tab w:val="left" w:pos="284"/>
+          <w:tab w:val="left" w:pos="630"/>
+          <w:tab w:val="left" w:pos="900"/>
+        </w:tabs>
+        <w:ind w:left="284"/>
+        <w:rPr>
+          <w:rFonts w:ascii="Garamond" w:eastAsia="Garamond" w:hAnsi="Garamond" w:cs="Garamond"/>
+          <w:color w:val="404040"/>
+          <w:sz w:val="21"/>
+          <w:szCs w:val="21"/>
+        </w:rPr>
+      </w:pPr>
+    </w:p>
+    <w:p>
+      <w:pPr>
+        <w:tabs>
+          <w:tab w:val="left" w:pos="284"/>
+          <w:tab w:val="left" w:pos="630"/>
+          <w:tab w:val="left" w:pos="900"/>
+        </w:tabs>
+        <w:ind w:left="284"/>
+        <w:rPr>
+          <w:rFonts w:ascii="Garamond" w:eastAsia="Garamond" w:hAnsi="Garamond" w:cs="Garamond"/>
+          <w:color w:val="404040"/>
+          <w:sz w:val="21"/>
+          <w:szCs w:val="21"/>
+        </w:rPr>
+      </w:pPr>
+    </w:p>
+    <w:p>
+      <w:pPr>
+        <w:tabs>
+          <w:tab w:val="left" w:pos="284"/>
+          <w:tab w:val="left" w:pos="630"/>
+          <w:tab w:val="left" w:pos="900"/>
+        </w:tabs>
+        <w:ind w:left="284"/>
+        <w:rPr>
+          <w:rFonts w:ascii="Garamond" w:eastAsia="Garamond" w:hAnsi="Garamond" w:cs="Garamond"/>
+          <w:color w:val="404040"/>
+          <w:sz w:val="21"/>
+          <w:szCs w:val="21"/>
+        </w:rPr>
+      </w:pPr>
+    </w:p>
+    <w:p>
+      <w:pPr>
+        <w:tabs>
+          <w:tab w:val="left" w:pos="284"/>
+          <w:tab w:val="left" w:pos="630"/>
+          <w:tab w:val="left" w:pos="900"/>
+        </w:tabs>
+        <w:ind w:left="284"/>
+        <w:rPr>
+          <w:rFonts w:ascii="Garamond" w:eastAsia="Garamond" w:hAnsi="Garamond" w:cs="Garamond"/>
+          <w:color w:val="404040"/>
+          <w:sz w:val="21"/>
+          <w:szCs w:val="21"/>
+        </w:rPr>
+      </w:pPr>
+    </w:p>
+    <w:p>
+      <w:pPr>
+        <w:tabs>
+          <w:tab w:val="left" w:pos="284"/>
+          <w:tab w:val="left" w:pos="630"/>
+          <w:tab w:val="left" w:pos="900"/>
+        </w:tabs>
+        <w:ind w:left="284"/>
+        <w:rPr>
+          <w:rFonts w:ascii="Garamond" w:eastAsia="Garamond" w:hAnsi="Garamond" w:cs="Garamond"/>
+          <w:color w:val="404040"/>
+          <w:sz w:val="21"/>
+          <w:szCs w:val="21"/>
+        </w:rPr>
+      </w:pPr>
     </w:p>
     <w:p>
       <w:pPr>
@@ -1142,6 +1706,7 @@
           <w:sz w:val="22"/>
           <w:szCs w:val="22"/>
         </w:rPr>
+        <w:lastRenderedPageBreak/>
         <w:t>PROJECTS</w:t>
       </w:r>
       <w:r>
@@ -1228,15 +1793,115 @@
           <w:sz w:val="21"/>
           <w:szCs w:val="21"/>
         </w:rPr>
-        <w:t>Developed and maintained REST APIs using Vue.js and Node.js, supporting 3,800+ daily Jira tickets, reducing response time by 40%, and delivering operational savings equivalent to 3.6 FTEs.</w:t>
-      </w:r>
-      <w:r>
-        <w:rPr>
-          <w:rFonts w:ascii="Garamond" w:eastAsia="Garamond" w:hAnsi="Garamond" w:cs="Garamond"/>
-          <w:sz w:val="21"/>
-          <w:szCs w:val="21"/>
-        </w:rPr>
-        <w:t xml:space="preserve"> </w:t>
+        <w:t xml:space="preserve">Developed and maintained REST APIs using </w:t>
+      </w:r>
+      <w:r>
+        <w:rPr>
+          <w:rFonts w:ascii="Garamond" w:eastAsia="Times New Roman" w:hAnsi="Garamond" w:cs="Segoe UI"/>
+          <w:b/>
+          <w:bCs/>
+          <w:sz w:val="21"/>
+          <w:szCs w:val="21"/>
+        </w:rPr>
+        <w:t>Vue.js</w:t>
+      </w:r>
+      <w:r>
+        <w:rPr>
+          <w:rFonts w:ascii="Garamond" w:eastAsia="Times New Roman" w:hAnsi="Garamond" w:cs="Segoe UI"/>
+          <w:sz w:val="21"/>
+          <w:szCs w:val="21"/>
+        </w:rPr>
+        <w:t xml:space="preserve"> and </w:t>
+      </w:r>
+      <w:r>
+        <w:rPr>
+          <w:rFonts w:ascii="Garamond" w:eastAsia="Times New Roman" w:hAnsi="Garamond" w:cs="Segoe UI"/>
+          <w:b/>
+          <w:bCs/>
+          <w:sz w:val="21"/>
+          <w:szCs w:val="21"/>
+        </w:rPr>
+        <w:t>Node.js</w:t>
+      </w:r>
+      <w:r>
+        <w:rPr>
+          <w:rFonts w:ascii="Garamond" w:eastAsia="Times New Roman" w:hAnsi="Garamond" w:cs="Segoe UI"/>
+          <w:sz w:val="21"/>
+          <w:szCs w:val="21"/>
+        </w:rPr>
+        <w:t xml:space="preserve">, integrating </w:t>
+      </w:r>
+      <w:r>
+        <w:rPr>
+          <w:rFonts w:ascii="Garamond" w:eastAsia="Times New Roman" w:hAnsi="Garamond" w:cs="Segoe UI"/>
+          <w:b/>
+          <w:bCs/>
+          <w:sz w:val="21"/>
+          <w:szCs w:val="21"/>
+        </w:rPr>
+        <w:t>Jira, Monday.com, and Outlook</w:t>
+      </w:r>
+      <w:r>
+        <w:rPr>
+          <w:rFonts w:ascii="Garamond" w:eastAsia="Times New Roman" w:hAnsi="Garamond" w:cs="Segoe UI"/>
+          <w:sz w:val="21"/>
+          <w:szCs w:val="21"/>
+        </w:rPr>
+        <w:t xml:space="preserve"> to support </w:t>
+      </w:r>
+      <w:r>
+        <w:rPr>
+          <w:rFonts w:ascii="Garamond" w:eastAsia="Times New Roman" w:hAnsi="Garamond" w:cs="Segoe UI"/>
+          <w:b/>
+          <w:bCs/>
+          <w:sz w:val="21"/>
+          <w:szCs w:val="21"/>
+        </w:rPr>
+        <w:t>3,800+ daily tickets</w:t>
+      </w:r>
+      <w:r>
+        <w:rPr>
+          <w:rFonts w:ascii="Garamond" w:eastAsia="Times New Roman" w:hAnsi="Garamond" w:cs="Segoe UI"/>
+          <w:sz w:val="21"/>
+          <w:szCs w:val="21"/>
+        </w:rPr>
+        <w:t xml:space="preserve">, reduce response time by </w:t>
+      </w:r>
+      <w:r>
+        <w:rPr>
+          <w:rFonts w:ascii="Garamond" w:eastAsia="Times New Roman" w:hAnsi="Garamond" w:cs="Segoe UI"/>
+          <w:b/>
+          <w:bCs/>
+          <w:sz w:val="21"/>
+          <w:szCs w:val="21"/>
+        </w:rPr>
+        <w:t>40%</w:t>
+      </w:r>
+      <w:r>
+        <w:rPr>
+          <w:rFonts w:ascii="Garamond" w:eastAsia="Times New Roman" w:hAnsi="Garamond" w:cs="Segoe UI"/>
+          <w:sz w:val="21"/>
+          <w:szCs w:val="21"/>
+        </w:rPr>
+        <w:t xml:space="preserve">, and deliver </w:t>
+      </w:r>
+      <w:r>
+        <w:rPr>
+          <w:rFonts w:ascii="Garamond" w:eastAsia="Times New Roman" w:hAnsi="Garamond" w:cs="Segoe UI"/>
+          <w:b/>
+          <w:bCs/>
+          <w:sz w:val="21"/>
+          <w:szCs w:val="21"/>
+        </w:rPr>
+        <w:t>3.6 FTE</w:t>
+      </w:r>
+      <w:r>
+        <w:rPr>
+          <w:rFonts w:ascii="Garamond" w:eastAsia="Times New Roman" w:hAnsi="Garamond" w:cs="Segoe UI"/>
+          <w:sz w:val="21"/>
+          <w:szCs w:val="21"/>
+        </w:rPr>
+        <w:t xml:space="preserve"> savings.</w:t>
       </w:r>
     </w:p>
     <w:p>
@@ -1528,7 +2193,6 @@
           <w:sz w:val="21"/>
           <w:szCs w:val="21"/>
         </w:rPr>
-        <w:lastRenderedPageBreak/>
         <w:t>A 2D running game where you as a student aim to collect and save coins &amp; avoid obstacles (expenses) in given time limit.</w:t>
       </w:r>
     </w:p>
@@ -2140,6 +2804,155 @@
     </w:lvl>
   </w:abstractNum>
   <w:abstractNum w:abstractNumId="1" w15:restartNumberingAfterBreak="0">
+    <w:nsid w:val="259A4D0E"/>
+    <w:multiLevelType w:val="multilevel"/>
+    <w:tmpl w:val="C6BE1EE8"/>
+    <w:lvl w:ilvl="0">
+      <w:start w:val="1"/>
+      <w:numFmt w:val="bullet"/>
+      <w:lvlText w:val=""/>
+      <w:lvlJc w:val="left"/>
+      <w:pPr>
+        <w:tabs>
+          <w:tab w:val="num" w:pos="720"/>
+        </w:tabs>
+        <w:ind w:left="720" w:hanging="360"/>
+      </w:pPr>
+      <w:rPr>
+        <w:rFonts w:ascii="Symbol" w:hAnsi="Symbol" w:hint="default"/>
+        <w:sz w:val="20"/>
+      </w:rPr>
+    </w:lvl>
+    <w:lvl w:ilvl="1" w:tentative="1">
+      <w:start w:val="1"/>
+      <w:numFmt w:val="bullet"/>
+      <w:lvlText w:val="o"/>
+      <w:lvlJc w:val="left"/>
+      <w:pPr>
+        <w:tabs>
+          <w:tab w:val="num" w:pos="1440"/>
+        </w:tabs>
+        <w:ind w:left="1440" w:hanging="360"/>
+      </w:pPr>
+      <w:rPr>
+        <w:rFonts w:ascii="Courier New" w:hAnsi="Courier New" w:hint="default"/>
+        <w:sz w:val="20"/>
+      </w:rPr>
+    </w:lvl>
+    <w:lvl w:ilvl="2" w:tentative="1">
+      <w:start w:val="1"/>
+      <w:numFmt w:val="bullet"/>
+      <w:lvlText w:val=""/>
+      <w:lvlJc w:val="left"/>
+      <w:pPr>
+        <w:tabs>
+          <w:tab w:val="num" w:pos="2160"/>
+        </w:tabs>
+        <w:ind w:left="2160" w:hanging="360"/>
+      </w:pPr>
+      <w:rPr>
+        <w:rFonts w:ascii="Wingdings" w:hAnsi="Wingdings" w:hint="default"/>
+        <w:sz w:val="20"/>
+      </w:rPr>
+    </w:lvl>
+    <w:lvl w:ilvl="3" w:tentative="1">
+      <w:start w:val="1"/>
+      <w:numFmt w:val="bullet"/>
+      <w:lvlText w:val=""/>
+      <w:lvlJc w:val="left"/>
+      <w:pPr>
+        <w:tabs>
+          <w:tab w:val="num" w:pos="2880"/>
+        </w:tabs>
+        <w:ind w:left="2880" w:hanging="360"/>
+      </w:pPr>
+      <w:rPr>
+        <w:rFonts w:ascii="Wingdings" w:hAnsi="Wingdings" w:hint="default"/>
+        <w:sz w:val="20"/>
+      </w:rPr>
+    </w:lvl>
+    <w:lvl w:ilvl="4" w:tentative="1">
+      <w:start w:val="1"/>
+      <w:numFmt w:val="bullet"/>
+      <w:lvlText w:val=""/>
+      <w:lvlJc w:val="left"/>
+      <w:pPr>
+        <w:tabs>
+          <w:tab w:val="num" w:pos="3600"/>
+        </w:tabs>
+        <w:ind w:left="3600" w:hanging="360"/>
+      </w:pPr>
+      <w:rPr>
+        <w:rFonts w:ascii="Wingdings" w:hAnsi="Wingdings" w:hint="default"/>
+        <w:sz w:val="20"/>
+      </w:rPr>
+    </w:lvl>
+    <w:lvl w:ilvl="5" w:tentative="1">
+      <w:start w:val="1"/>
+      <w:numFmt w:val="bullet"/>
+      <w:lvlText w:val=""/>
+      <w:lvlJc w:val="left"/>
+      <w:pPr>
+        <w:tabs>
+          <w:tab w:val="num" w:pos="4320"/>
+        </w:tabs>
+        <w:ind w:left="4320" w:hanging="360"/>
+      </w:pPr>
+      <w:rPr>
+        <w:rFonts w:ascii="Wingdings" w:hAnsi="Wingdings" w:hint="default"/>
+        <w:sz w:val="20"/>
+      </w:rPr>
+    </w:lvl>
+    <w:lvl w:ilvl="6" w:tentative="1">
+      <w:start w:val="1"/>
+      <w:numFmt w:val="bullet"/>
+      <w:lvlText w:val=""/>
+      <w:lvlJc w:val="left"/>
+      <w:pPr>
+        <w:tabs>
+          <w:tab w:val="num" w:pos="5040"/>
+        </w:tabs>
+        <w:ind w:left="5040" w:hanging="360"/>
+      </w:pPr>
+      <w:rPr>
+        <w:rFonts w:ascii="Wingdings" w:hAnsi="Wingdings" w:hint="default"/>
+        <w:sz w:val="20"/>
+      </w:rPr>
+    </w:lvl>
+    <w:lvl w:ilvl="7" w:tentative="1">
+      <w:start w:val="1"/>
+      <w:numFmt w:val="bullet"/>
+      <w:lvlText w:val=""/>
+      <w:lvlJc w:val="left"/>
+      <w:pPr>
+        <w:tabs>
+          <w:tab w:val="num" w:pos="5760"/>
+        </w:tabs>
+        <w:ind w:left="5760" w:hanging="360"/>
+      </w:pPr>
+      <w:rPr>
+        <w:rFonts w:ascii="Wingdings" w:hAnsi="Wingdings" w:hint="default"/>
+        <w:sz w:val="20"/>
+      </w:rPr>
+    </w:lvl>
+    <w:lvl w:ilvl="8" w:tentative="1">
+      <w:start w:val="1"/>
+      <w:numFmt w:val="bullet"/>
+      <w:lvlText w:val=""/>
+      <w:lvlJc w:val="left"/>
+      <w:pPr>
+        <w:tabs>
+          <w:tab w:val="num" w:pos="6480"/>
+        </w:tabs>
+        <w:ind w:left="6480" w:hanging="360"/>
+      </w:pPr>
+      <w:rPr>
+        <w:rFonts w:ascii="Wingdings" w:hAnsi="Wingdings" w:hint="default"/>
+        <w:sz w:val="20"/>
+      </w:rPr>
+    </w:lvl>
+  </w:abstractNum>
+  <w:abstractNum w:abstractNumId="2" w15:restartNumberingAfterBreak="0">
     <w:nsid w:val="278670A2"/>
     <w:multiLevelType w:val="multilevel"/>
     <w:tmpl w:val="964C4828"/>
@@ -2288,7 +3101,7 @@
       </w:rPr>
     </w:lvl>
   </w:abstractNum>
-  <w:abstractNum w:abstractNumId="2" w15:restartNumberingAfterBreak="0">
+  <w:abstractNum w:abstractNumId="3" w15:restartNumberingAfterBreak="0">
     <w:nsid w:val="2BE068AB"/>
     <w:multiLevelType w:val="hybridMultilevel"/>
     <w:tmpl w:val="9690B2C8"/>
@@ -2402,7 +3215,7 @@
       </w:rPr>
     </w:lvl>
   </w:abstractNum>
-  <w:abstractNum w:abstractNumId="3" w15:restartNumberingAfterBreak="0">
+  <w:abstractNum w:abstractNumId="4" w15:restartNumberingAfterBreak="0">
     <w:nsid w:val="2E5F216A"/>
     <w:multiLevelType w:val="multilevel"/>
     <w:tmpl w:val="2E6430A2"/>
@@ -2551,7 +3364,7 @@
       </w:rPr>
     </w:lvl>
   </w:abstractNum>
-  <w:abstractNum w:abstractNumId="4" w15:restartNumberingAfterBreak="0">
+  <w:abstractNum w:abstractNumId="5" w15:restartNumberingAfterBreak="0">
     <w:nsid w:val="413B28F7"/>
     <w:multiLevelType w:val="multilevel"/>
     <w:tmpl w:val="A86822A8"/>
@@ -2700,7 +3513,156 @@
       </w:rPr>
     </w:lvl>
   </w:abstractNum>
-  <w:abstractNum w:abstractNumId="5" w15:restartNumberingAfterBreak="0">
+  <w:abstractNum w:abstractNumId="6" w15:restartNumberingAfterBreak="0">
+    <w:nsid w:val="453660ED"/>
+    <w:multiLevelType w:val="multilevel"/>
+    <w:tmpl w:val="571662F2"/>
+    <w:lvl w:ilvl="0">
+      <w:start w:val="1"/>
+      <w:numFmt w:val="bullet"/>
+      <w:lvlText w:val=""/>
+      <w:lvlJc w:val="left"/>
+      <w:pPr>
+        <w:tabs>
+          <w:tab w:val="num" w:pos="720"/>
+        </w:tabs>
+        <w:ind w:left="720" w:hanging="360"/>
+      </w:pPr>
+      <w:rPr>
+        <w:rFonts w:ascii="Symbol" w:hAnsi="Symbol" w:hint="default"/>
+        <w:sz w:val="20"/>
+      </w:rPr>
+    </w:lvl>
+    <w:lvl w:ilvl="1" w:tentative="1">
+      <w:start w:val="1"/>
+      <w:numFmt w:val="bullet"/>
+      <w:lvlText w:val="o"/>
+      <w:lvlJc w:val="left"/>
+      <w:pPr>
+        <w:tabs>
+          <w:tab w:val="num" w:pos="1440"/>
+        </w:tabs>
+        <w:ind w:left="1440" w:hanging="360"/>
+      </w:pPr>
+      <w:rPr>
+        <w:rFonts w:ascii="Courier New" w:hAnsi="Courier New" w:hint="default"/>
+        <w:sz w:val="20"/>
+      </w:rPr>
+    </w:lvl>
+    <w:lvl w:ilvl="2" w:tentative="1">
+      <w:start w:val="1"/>
+      <w:numFmt w:val="bullet"/>
+      <w:lvlText w:val=""/>
+      <w:lvlJc w:val="left"/>
+      <w:pPr>
+        <w:tabs>
+          <w:tab w:val="num" w:pos="2160"/>
+        </w:tabs>
+        <w:ind w:left="2160" w:hanging="360"/>
+      </w:pPr>
+      <w:rPr>
+        <w:rFonts w:ascii="Wingdings" w:hAnsi="Wingdings" w:hint="default"/>
+        <w:sz w:val="20"/>
+      </w:rPr>
+    </w:lvl>
+    <w:lvl w:ilvl="3" w:tentative="1">
+      <w:start w:val="1"/>
+      <w:numFmt w:val="bullet"/>
+      <w:lvlText w:val=""/>
+      <w:lvlJc w:val="left"/>
+      <w:pPr>
+        <w:tabs>
+          <w:tab w:val="num" w:pos="2880"/>
+        </w:tabs>
+        <w:ind w:left="2880" w:hanging="360"/>
+      </w:pPr>
+      <w:rPr>
+        <w:rFonts w:ascii="Wingdings" w:hAnsi="Wingdings" w:hint="default"/>
+        <w:sz w:val="20"/>
+      </w:rPr>
+    </w:lvl>
+    <w:lvl w:ilvl="4" w:tentative="1">
+      <w:start w:val="1"/>
+      <w:numFmt w:val="bullet"/>
+      <w:lvlText w:val=""/>
+      <w:lvlJc w:val="left"/>
+      <w:pPr>
+        <w:tabs>
+          <w:tab w:val="num" w:pos="3600"/>
+        </w:tabs>
+        <w:ind w:left="3600" w:hanging="360"/>
+      </w:pPr>
+      <w:rPr>
+        <w:rFonts w:ascii="Wingdings" w:hAnsi="Wingdings" w:hint="default"/>
+        <w:sz w:val="20"/>
+      </w:rPr>
+    </w:lvl>
+    <w:lvl w:ilvl="5" w:tentative="1">
+      <w:start w:val="1"/>
+      <w:numFmt w:val="bullet"/>
+      <w:lvlText w:val=""/>
+      <w:lvlJc w:val="left"/>
+      <w:pPr>
+        <w:tabs>
+          <w:tab w:val="num" w:pos="4320"/>
+        </w:tabs>
+        <w:ind w:left="4320" w:hanging="360"/>
+      </w:pPr>
+      <w:rPr>
+        <w:rFonts w:ascii="Wingdings" w:hAnsi="Wingdings" w:hint="default"/>
+        <w:sz w:val="20"/>
+      </w:rPr>
+    </w:lvl>
+    <w:lvl w:ilvl="6" w:tentative="1">
+      <w:start w:val="1"/>
+      <w:numFmt w:val="bullet"/>
+      <w:lvlText w:val=""/>
+      <w:lvlJc w:val="left"/>
+      <w:pPr>
+        <w:tabs>
+          <w:tab w:val="num" w:pos="5040"/>
+        </w:tabs>
+        <w:ind w:left="5040" w:hanging="360"/>
+      </w:pPr>
+      <w:rPr>
+        <w:rFonts w:ascii="Wingdings" w:hAnsi="Wingdings" w:hint="default"/>
+        <w:sz w:val="20"/>
+      </w:rPr>
+    </w:lvl>
+    <w:lvl w:ilvl="7" w:tentative="1">
+      <w:start w:val="1"/>
+      <w:numFmt w:val="bullet"/>
+      <w:lvlText w:val=""/>
+      <w:lvlJc w:val="left"/>
+      <w:pPr>
+        <w:tabs>
+          <w:tab w:val="num" w:pos="5760"/>
+        </w:tabs>
+        <w:ind w:left="5760" w:hanging="360"/>
+      </w:pPr>
+      <w:rPr>
+        <w:rFonts w:ascii="Wingdings" w:hAnsi="Wingdings" w:hint="default"/>
+        <w:sz w:val="20"/>
+      </w:rPr>
+    </w:lvl>
+    <w:lvl w:ilvl="8" w:tentative="1">
+      <w:start w:val="1"/>
+      <w:numFmt w:val="bullet"/>
+      <w:lvlText w:val=""/>
+      <w:lvlJc w:val="left"/>
+      <w:pPr>
+        <w:tabs>
+          <w:tab w:val="num" w:pos="6480"/>
+        </w:tabs>
+        <w:ind w:left="6480" w:hanging="360"/>
+      </w:pPr>
+      <w:rPr>
+        <w:rFonts w:ascii="Wingdings" w:hAnsi="Wingdings" w:hint="default"/>
+        <w:sz w:val="20"/>
+      </w:rPr>
+    </w:lvl>
+  </w:abstractNum>
+  <w:abstractNum w:abstractNumId="7" w15:restartNumberingAfterBreak="0">
     <w:nsid w:val="69941A81"/>
     <w:multiLevelType w:val="multilevel"/>
     <w:tmpl w:val="EB38869E"/>
@@ -2822,7 +3784,7 @@
       </w:rPr>
     </w:lvl>
   </w:abstractNum>
-  <w:abstractNum w:abstractNumId="6" w15:restartNumberingAfterBreak="0">
+  <w:abstractNum w:abstractNumId="8" w15:restartNumberingAfterBreak="0">
     <w:nsid w:val="6C346089"/>
     <w:multiLevelType w:val="multilevel"/>
     <w:tmpl w:val="8266F902"/>
@@ -2971,7 +3933,7 @@
       </w:rPr>
     </w:lvl>
   </w:abstractNum>
-  <w:abstractNum w:abstractNumId="7" w15:restartNumberingAfterBreak="0">
+  <w:abstractNum w:abstractNumId="9" w15:restartNumberingAfterBreak="0">
     <w:nsid w:val="7C52174E"/>
     <w:multiLevelType w:val="multilevel"/>
     <w:tmpl w:val="8AF415E4"/>
@@ -3121,28 +4083,34 @@
     </w:lvl>
   </w:abstractNum>
   <w:num w:numId="1" w16cid:durableId="1882010086">
+    <w:abstractNumId w:val="7"/>
+  </w:num>
+  <w:num w:numId="2" w16cid:durableId="174536367">
+    <w:abstractNumId w:val="3"/>
+  </w:num>
+  <w:num w:numId="3" w16cid:durableId="740523122">
+    <w:abstractNumId w:val="8"/>
+  </w:num>
+  <w:num w:numId="4" w16cid:durableId="462433091">
+    <w:abstractNumId w:val="4"/>
+  </w:num>
+  <w:num w:numId="5" w16cid:durableId="1726366517">
     <w:abstractNumId w:val="5"/>
   </w:num>
-  <w:num w:numId="2" w16cid:durableId="174536367">
+  <w:num w:numId="6" w16cid:durableId="1379817919">
     <w:abstractNumId w:val="2"/>
   </w:num>
-  <w:num w:numId="3" w16cid:durableId="740523122">
-    <w:abstractNumId w:val="6"/>
-  </w:num>
-  <w:num w:numId="4" w16cid:durableId="462433091">
-    <w:abstractNumId w:val="3"/>
-  </w:num>
-  <w:num w:numId="5" w16cid:durableId="1726366517">
-    <w:abstractNumId w:val="4"/>
-  </w:num>
-  <w:num w:numId="6" w16cid:durableId="1379817919">
-    <w:abstractNumId w:val="1"/>
-  </w:num>
   <w:num w:numId="7" w16cid:durableId="113058669">
-    <w:abstractNumId w:val="7"/>
+    <w:abstractNumId w:val="9"/>
   </w:num>
   <w:num w:numId="8" w16cid:durableId="1985428185">
     <w:abstractNumId w:val="0"/>
+  </w:num>
+  <w:num w:numId="9" w16cid:durableId="361825045">
+    <w:abstractNumId w:val="1"/>
+  </w:num>
+  <w:num w:numId="10" w16cid:durableId="637495361">
+    <w:abstractNumId w:val="6"/>
   </w:num>
 </w:numbering>
 </file>
@@ -3667,7 +4635,6 @@
   <w:style w:type="character" w:default="1" w:styleId="DefaultParagraphFont">
     <w:name w:val="Default Paragraph Font"/>
     <w:uiPriority w:val="1"/>
-    <w:semiHidden/>
     <w:unhideWhenUsed/>
   </w:style>
   <w:style w:type="table" w:default="1" w:styleId="TableNormal">
@@ -3780,6 +4747,17 @@
       <w:rFonts w:ascii="Times New Roman" w:eastAsia="Times New Roman" w:hAnsi="Times New Roman" w:cs="Times New Roman"/>
       <w:sz w:val="22"/>
       <w:szCs w:val="22"/>
+    </w:rPr>
+  </w:style>
+  <w:style w:type="character" w:styleId="Strong">
+    <w:name w:val="Strong"/>
+    <w:basedOn w:val="DefaultParagraphFont"/>
+    <w:uiPriority w:val="22"/>
+    <w:qFormat/>
+    <w:rsid w:val="00C85F1C"/>
+    <w:rPr>
+      <w:b/>
+      <w:bCs/>
     </w:rPr>
   </w:style>
 </w:styles>

</xml_diff>